<commit_message>
feat: support CSV export
</commit_message>
<xml_diff>
--- a/Assesment Design.docx
+++ b/Assesment Design.docx
@@ -225,138 +225,294 @@
     <w:p>
       <w:pPr>
         <w:rPr>
-          <w:rFonts w:hint="eastAsia"/>
-          <w:lang w:val="en-US" w:eastAsia="zh-CN"/>
-        </w:rPr>
-      </w:pPr>
-      <w:r>
-        <w:rPr>
-          <w:rFonts w:hint="eastAsia"/>
-          <w:lang w:val="en-US" w:eastAsia="zh-CN"/>
-        </w:rPr>
-        <w:t>Step6: Complete the CSV export function</w:t>
-      </w:r>
-    </w:p>
-    <w:p>
-      <w:pPr>
-        <w:rPr>
-          <w:rFonts w:hint="eastAsia"/>
-          <w:lang w:val="en-US" w:eastAsia="zh-CN"/>
-        </w:rPr>
-      </w:pPr>
-      <w:r>
-        <w:rPr>
-          <w:rFonts w:hint="eastAsia"/>
-          <w:lang w:val="en-US" w:eastAsia="zh-CN"/>
-        </w:rPr>
-        <w:t>Step7: Complete the AUTO testing for all functions</w:t>
-      </w:r>
-    </w:p>
-    <w:p>
-      <w:pPr>
-        <w:rPr>
-          <w:rFonts w:hint="default"/>
-          <w:lang w:val="en-US" w:eastAsia="zh-CN"/>
-        </w:rPr>
-      </w:pPr>
-      <w:r>
-        <w:rPr>
-          <w:rFonts w:hint="eastAsia"/>
-          <w:lang w:val="en-US" w:eastAsia="zh-CN"/>
-        </w:rPr>
-        <w:t>Step8: Write README and instruction ( if need write a script)</w:t>
-      </w:r>
-    </w:p>
-    <w:p>
-      <w:pPr>
-        <w:rPr>
-          <w:rFonts w:hint="eastAsia"/>
-          <w:lang w:val="en-US" w:eastAsia="zh-CN"/>
-        </w:rPr>
-      </w:pPr>
-    </w:p>
-    <w:p>
-      <w:pPr>
-        <w:rPr>
-          <w:rFonts w:hint="eastAsia"/>
-          <w:lang w:val="en-US" w:eastAsia="zh-CN"/>
-        </w:rPr>
-      </w:pPr>
-      <w:r>
-        <w:rPr>
-          <w:rFonts w:hint="eastAsia"/>
-          <w:lang w:val="en-US" w:eastAsia="zh-CN"/>
-        </w:rPr>
-        <w:t>Project testing</w:t>
-      </w:r>
-      <w:r>
-        <w:rPr>
-          <w:rFonts w:hint="eastAsia"/>
-          <w:lang w:val="en-US" w:eastAsia="zh-CN"/>
-        </w:rPr>
-        <w:br w:type="textWrapping"/>
-      </w:r>
-      <w:r>
-        <w:rPr>
-          <w:rFonts w:hint="eastAsia"/>
-          <w:lang w:val="en-US" w:eastAsia="zh-CN"/>
-        </w:rPr>
-        <w:t>Using AI to help complete Auto testing, manually testing will focus on the edge case/error retry/Frontend+backend integration test.</w:t>
-      </w:r>
-    </w:p>
-    <w:p>
-      <w:pPr>
-        <w:rPr>
-          <w:rFonts w:hint="eastAsia"/>
-          <w:lang w:val="en-US" w:eastAsia="zh-CN"/>
-        </w:rPr>
-      </w:pPr>
-      <w:r>
-        <w:rPr>
-          <w:rFonts w:hint="eastAsia"/>
-          <w:lang w:val="en-US" w:eastAsia="zh-CN"/>
-        </w:rPr>
-        <w:t>Check each modification in code, make sure no dangerous change</w:t>
-      </w:r>
-    </w:p>
-    <w:p>
-      <w:pPr>
-        <w:rPr>
-          <w:rFonts w:hint="eastAsia"/>
-          <w:lang w:val="en-US" w:eastAsia="zh-CN"/>
-        </w:rPr>
-      </w:pPr>
-    </w:p>
-    <w:p>
-      <w:pPr>
-        <w:rPr>
-          <w:rFonts w:hint="default"/>
-          <w:lang w:val="en-US" w:eastAsia="zh-CN"/>
-        </w:rPr>
-      </w:pPr>
-      <w:r>
-        <w:rPr>
-          <w:rFonts w:hint="eastAsia"/>
-          <w:lang w:val="en-US" w:eastAsia="zh-CN"/>
-        </w:rPr>
-        <w:t>Challenge</w:t>
-      </w:r>
-      <w:r>
-        <w:rPr>
-          <w:rFonts w:hint="eastAsia"/>
-          <w:lang w:val="en-US" w:eastAsia="zh-CN"/>
-        </w:rPr>
-        <w:br w:type="textWrapping"/>
-      </w:r>
-      <w:r>
-        <w:rPr>
-          <w:rFonts w:hint="eastAsia"/>
-          <w:lang w:val="en-US" w:eastAsia="zh-CN"/>
-        </w:rPr>
-        <w:t>1. TimeZone between different tenants: Store timestamps in UTC and use IANA timezone identifiers for tenant-local date handling.</w:t>
+          <w:rFonts w:hint="default"/>
+          <w:lang w:val="en-US" w:eastAsia="zh-CN"/>
+        </w:rPr>
+      </w:pPr>
+      <w:r>
+        <w:rPr>
+          <w:rFonts w:hint="eastAsia"/>
+          <w:lang w:val="en-US" w:eastAsia="zh-CN"/>
+        </w:rPr>
+        <w:t>Step6: Complete the CSV export function - Do we need to show valid/revoked in file?</w:t>
       </w:r>
       <w:bookmarkStart w:id="0" w:name="_GoBack"/>
       <w:bookmarkEnd w:id="0"/>
+    </w:p>
+    <w:p>
+      <w:pPr>
+        <w:rPr>
+          <w:rFonts w:hint="eastAsia"/>
+          <w:lang w:val="en-US" w:eastAsia="zh-CN"/>
+        </w:rPr>
+      </w:pPr>
+      <w:r>
+        <w:rPr>
+          <w:rFonts w:hint="eastAsia"/>
+          <w:lang w:val="en-US" w:eastAsia="zh-CN"/>
+        </w:rPr>
+        <w:t>Step7: Complete the AUTO testing for all functions</w:t>
+      </w:r>
+    </w:p>
+    <w:p>
+      <w:pPr>
+        <w:rPr>
+          <w:rFonts w:hint="default"/>
+          <w:lang w:val="en-US" w:eastAsia="zh-CN"/>
+        </w:rPr>
+      </w:pPr>
+      <w:r>
+        <w:rPr>
+          <w:rFonts w:hint="eastAsia"/>
+          <w:lang w:val="en-US" w:eastAsia="zh-CN"/>
+        </w:rPr>
+        <w:t>Step8: Write README and instruction ( if need write a script)</w:t>
+      </w:r>
+    </w:p>
+    <w:p>
+      <w:pPr>
+        <w:rPr>
+          <w:rFonts w:hint="eastAsia"/>
+          <w:lang w:val="en-US" w:eastAsia="zh-CN"/>
+        </w:rPr>
+      </w:pPr>
+    </w:p>
+    <w:p>
+      <w:pPr>
+        <w:rPr>
+          <w:rFonts w:hint="eastAsia"/>
+          <w:lang w:val="en-US" w:eastAsia="zh-CN"/>
+        </w:rPr>
+      </w:pPr>
+      <w:r>
+        <w:rPr>
+          <w:rFonts w:hint="eastAsia"/>
+          <w:lang w:val="en-US" w:eastAsia="zh-CN"/>
+        </w:rPr>
+        <w:t>Project testing</w:t>
+      </w:r>
+      <w:r>
+        <w:rPr>
+          <w:rFonts w:hint="eastAsia"/>
+          <w:lang w:val="en-US" w:eastAsia="zh-CN"/>
+        </w:rPr>
+        <w:br w:type="textWrapping"/>
+      </w:r>
+      <w:r>
+        <w:rPr>
+          <w:rFonts w:hint="eastAsia"/>
+          <w:lang w:val="en-US" w:eastAsia="zh-CN"/>
+        </w:rPr>
+        <w:t>Using AI to help complete Auto testing, manually testing will focus on the edge case/error retry/Frontend+backend integration test.</w:t>
+      </w:r>
+    </w:p>
+    <w:p>
+      <w:pPr>
+        <w:rPr>
+          <w:rFonts w:hint="eastAsia"/>
+          <w:lang w:val="en-US" w:eastAsia="zh-CN"/>
+        </w:rPr>
+      </w:pPr>
+      <w:r>
+        <w:rPr>
+          <w:rFonts w:hint="eastAsia"/>
+          <w:lang w:val="en-US" w:eastAsia="zh-CN"/>
+        </w:rPr>
+        <w:t>Check each modification in code, make sure no dangerous change</w:t>
+      </w:r>
+    </w:p>
+    <w:p>
+      <w:pPr>
+        <w:rPr>
+          <w:rFonts w:hint="eastAsia"/>
+          <w:lang w:val="en-US" w:eastAsia="zh-CN"/>
+        </w:rPr>
+      </w:pPr>
+    </w:p>
+    <w:p>
+      <w:pPr>
+        <w:rPr>
+          <w:rFonts w:hint="eastAsia"/>
+          <w:lang w:val="en-US" w:eastAsia="zh-CN"/>
+        </w:rPr>
+      </w:pPr>
+      <w:r>
+        <w:rPr>
+          <w:rFonts w:hint="eastAsia"/>
+          <w:lang w:val="en-US" w:eastAsia="zh-CN"/>
+        </w:rPr>
+        <w:t>Challenge</w:t>
+      </w:r>
+      <w:r>
+        <w:rPr>
+          <w:rFonts w:hint="eastAsia"/>
+          <w:lang w:val="en-US" w:eastAsia="zh-CN"/>
+        </w:rPr>
+        <w:br w:type="textWrapping"/>
+      </w:r>
+      <w:r>
+        <w:rPr>
+          <w:rFonts w:hint="eastAsia"/>
+          <w:lang w:val="en-US" w:eastAsia="zh-CN"/>
+        </w:rPr>
+        <w:t>TimeZone between different tenants: Store timestamps in UTC and use IANA timezone identifiers for tenant-local date handling.</w:t>
+      </w:r>
+    </w:p>
+    <w:p>
+      <w:pPr>
+        <w:rPr>
+          <w:rFonts w:hint="eastAsia"/>
+          <w:lang w:val="en-US" w:eastAsia="zh-CN"/>
+        </w:rPr>
+      </w:pPr>
+      <w:r>
+        <w:rPr>
+          <w:rFonts w:hint="eastAsia"/>
+          <w:lang w:val="en-US" w:eastAsia="zh-CN"/>
+        </w:rPr>
+        <w:t>Tenant Isolation, one specific tenant cannot open other tenant data/info</w:t>
+      </w:r>
+    </w:p>
+    <w:p>
+      <w:pPr>
+        <w:rPr>
+          <w:rFonts w:hint="eastAsia"/>
+          <w:lang w:val="en-US" w:eastAsia="zh-CN"/>
+        </w:rPr>
+      </w:pPr>
+    </w:p>
+    <w:p>
+      <w:pPr>
+        <w:rPr>
+          <w:rFonts w:hint="eastAsia"/>
+          <w:lang w:val="en-US" w:eastAsia="zh-CN"/>
+        </w:rPr>
+      </w:pPr>
+      <w:r>
+        <w:rPr>
+          <w:rFonts w:hint="eastAsia"/>
+          <w:lang w:val="en-US" w:eastAsia="zh-CN"/>
+        </w:rPr>
+        <w:t>Test edge case</w:t>
+      </w:r>
+      <w:r>
+        <w:rPr>
+          <w:rFonts w:hint="eastAsia"/>
+          <w:lang w:val="en-US" w:eastAsia="zh-CN"/>
+        </w:rPr>
+        <w:br w:type="textWrapping"/>
+      </w:r>
+      <w:r>
+        <w:rPr>
+          <w:rFonts w:hint="eastAsia"/>
+          <w:lang w:val="en-US" w:eastAsia="zh-CN"/>
+        </w:rPr>
+        <w:t>1. Revoke run several times - DB only has one audit log</w:t>
+      </w:r>
+    </w:p>
+    <w:p>
+      <w:pPr>
+        <w:numPr>
+          <w:ilvl w:val="0"/>
+          <w:numId w:val="1"/>
+        </w:numPr>
+        <w:rPr>
+          <w:rFonts w:hint="default"/>
+          <w:lang w:val="en-US" w:eastAsia="zh-CN"/>
+        </w:rPr>
+      </w:pPr>
+      <w:r>
+        <w:rPr>
+          <w:rFonts w:hint="eastAsia"/>
+          <w:lang w:val="en-US" w:eastAsia="zh-CN"/>
+        </w:rPr>
+        <w:t>Search List - empty/space/error input</w:t>
+      </w:r>
+    </w:p>
+    <w:p>
+      <w:pPr>
+        <w:numPr>
+          <w:ilvl w:val="0"/>
+          <w:numId w:val="1"/>
+        </w:numPr>
+        <w:rPr>
+          <w:rFonts w:hint="default"/>
+          <w:lang w:val="en-US" w:eastAsia="zh-CN"/>
+        </w:rPr>
+      </w:pPr>
+      <w:r>
+        <w:rPr>
+          <w:rFonts w:hint="eastAsia"/>
+          <w:lang w:val="en-US" w:eastAsia="zh-CN"/>
+        </w:rPr>
+        <w:t>CSV export - big table export (such as 100,000 data)</w:t>
+      </w:r>
+    </w:p>
+    <w:p>
+      <w:pPr>
+        <w:numPr>
+          <w:ilvl w:val="0"/>
+          <w:numId w:val="1"/>
+        </w:numPr>
+        <w:rPr>
+          <w:rFonts w:hint="default"/>
+          <w:lang w:val="en-US" w:eastAsia="zh-CN"/>
+        </w:rPr>
+      </w:pPr>
+      <w:r>
+        <w:rPr>
+          <w:rFonts w:hint="eastAsia"/>
+          <w:lang w:val="en-US" w:eastAsia="zh-CN"/>
+        </w:rPr>
+        <w:t>Bulk issuance - revoked won</w:t>
+      </w:r>
+      <w:r>
+        <w:rPr>
+          <w:rFonts w:hint="default"/>
+          <w:lang w:val="en-US" w:eastAsia="zh-CN"/>
+        </w:rPr>
+        <w:t>’</w:t>
+      </w:r>
+      <w:r>
+        <w:rPr>
+          <w:rFonts w:hint="eastAsia"/>
+          <w:lang w:val="en-US" w:eastAsia="zh-CN"/>
+        </w:rPr>
+        <w:t>t be issued, not enrolled won</w:t>
+      </w:r>
+      <w:r>
+        <w:rPr>
+          <w:rFonts w:hint="default"/>
+          <w:lang w:val="en-US" w:eastAsia="zh-CN"/>
+        </w:rPr>
+        <w:t>’</w:t>
+      </w:r>
+      <w:r>
+        <w:rPr>
+          <w:rFonts w:hint="eastAsia"/>
+          <w:lang w:val="en-US" w:eastAsia="zh-CN"/>
+        </w:rPr>
+        <w:t>t be issued, rerun same command will skip all issuance and no extra audit log data</w:t>
+      </w:r>
+    </w:p>
+    <w:p>
+      <w:pPr>
+        <w:numPr>
+          <w:ilvl w:val="0"/>
+          <w:numId w:val="1"/>
+        </w:numPr>
+        <w:rPr>
+          <w:rFonts w:hint="default"/>
+          <w:lang w:val="en-US" w:eastAsia="zh-CN"/>
+        </w:rPr>
+      </w:pPr>
+      <w:r>
+        <w:rPr>
+          <w:rFonts w:hint="eastAsia"/>
+          <w:lang w:val="en-US" w:eastAsia="zh-CN"/>
+        </w:rPr>
+        <w:t>Time zone check - store time in DB UTC, the real time is calculated base on UTC time and tenant_timezone</w:t>
+      </w:r>
     </w:p>
     <w:sectPr>
       <w:pgSz w:w="11906" w:h="16838"/>
@@ -366,6 +522,26 @@
     </w:sectPr>
   </w:body>
 </w:document>
+</file>
+
+<file path=word/numbering.xml><?xml version="1.0" encoding="utf-8"?>
+<w:numbering xmlns:wpc="http://schemas.microsoft.com/office/word/2010/wordprocessingCanvas" xmlns:mc="http://schemas.openxmlformats.org/markup-compatibility/2006" xmlns:o="urn:schemas-microsoft-com:office:office" xmlns:r="http://schemas.openxmlformats.org/officeDocument/2006/relationships" xmlns:m="http://schemas.openxmlformats.org/officeDocument/2006/math" xmlns:v="urn:schemas-microsoft-com:vml" xmlns:wp14="http://schemas.microsoft.com/office/word/2010/wordprocessingDrawing" xmlns:wp="http://schemas.openxmlformats.org/drawingml/2006/wordprocessingDrawing" xmlns:w10="urn:schemas-microsoft-com:office:word" xmlns:w="http://schemas.openxmlformats.org/wordprocessingml/2006/main" xmlns:w14="http://schemas.microsoft.com/office/word/2010/wordml" xmlns:wpg="http://schemas.microsoft.com/office/word/2010/wordprocessingGroup" xmlns:wpi="http://schemas.microsoft.com/office/word/2010/wordprocessingInk" xmlns:wne="http://schemas.microsoft.com/office/word/2006/wordml" xmlns:wps="http://schemas.microsoft.com/office/word/2010/wordprocessingShape" xmlns:wpsCustomData="http://www.wps.cn/officeDocument/2013/wpsCustomData" mc:Ignorable="w14 wp14">
+  <w:abstractNum w:abstractNumId="0">
+    <w:nsid w:val="41BDBA24"/>
+    <w:multiLevelType w:val="singleLevel"/>
+    <w:tmpl w:val="41BDBA24"/>
+    <w:lvl w:ilvl="0" w:tentative="0">
+      <w:start w:val="2"/>
+      <w:numFmt w:val="decimal"/>
+      <w:suff w:val="space"/>
+      <w:lvlText w:val="%1."/>
+      <w:lvlJc w:val="left"/>
+    </w:lvl>
+  </w:abstractNum>
+  <w:num w:numId="1">
+    <w:abstractNumId w:val="0"/>
+  </w:num>
+</w:numbering>
 </file>
 
 <file path=word/styles.xml><?xml version="1.0" encoding="utf-8"?>

</xml_diff>